<commit_message>
STU report: apply second review (autocorrelation-corrected p-values, wording)
Detrended p-values now account for autocorrelation, so no level or
detrended link is claimed as significant. Certified-stock, divergence,
Vietnam and robusta-to-KC statements restated to match the data.

Co-Authored-By: Claude Opus 5.5 <noreply@anthropic.com>
Claude-Session: https://claude.ai/code/session_01Hsy3bDWLR2oyncbyTiqnwU
</commit_message>
<xml_diff>
--- a/coffee_stu/Bilan_STU_Cafe_2010-2026.docx
+++ b/coffee_stu/Bilan_STU_Cafe_2010-2026.docx
@@ -38,7 +38,7 @@
         <w:keepNext/>
       </w:pPr>
       <w:r>
-        <w:t xml:space="preserve">Ce qui est solide</w:t>
+        <w:t xml:space="preserve">Ce que montrent les données</w:t>
       </w:r>
     </w:p>
     <w:p>
@@ -56,7 +56,7 @@
         <w:t xml:space="preserve">Stocks bas, prix hauts : la relation va dans le sens attendu. </w:t>
       </w:r>
       <w:r>
-        <w:t xml:space="preserve">STU mondial et prix : −0,63 avec le KC, −0,72 avec le DF ; une fois la tendance retirée, −0,58 et −0,59 : c'est le seul lien qui reste alors significatif (p ≈ 0,03). Mais il repose surtout sur l'épisode 2023/24-2025/26 (STU sous 8 %, prix records) : sans ces trois campagnes, la corrélation tombe à −0,26 (KC) et −0,21 (DF). Entre 9 et 16 % de STU, le niveau des stocks explique peu le prix.</w:t>
+        <w:t xml:space="preserve">STU mondial et prix : −0,63 avec le KC, −0,72 avec le DF ; une fois la tendance retirée, −0,58 et −0,59. C'est le lien de niveau le plus fort de l'étude, et il résiste au retrait de la tendance. Mais avec 16 campagnes très liées d'une année à l'autre, il n'est pas prouvé au sens statistique, et il repose surtout sur l'épisode 2023/24-2025/26 (STU sous 8 %, prix records) : sans ces trois campagnes, la corrélation tombe à −0,26 (KC) et −0,21 (DF). Entre 9 et 16 % de STU, le niveau des stocks explique peu le prix.</w:t>
       </w:r>
     </w:p>
     <w:p>
@@ -74,7 +74,7 @@
         <w:t xml:space="preserve">La production agit par anticipation. </w:t>
       </w:r>
       <w:r>
-        <w:t xml:space="preserve">Le DF réagit à la récolte de robusta de la campagne en cours (variations : −0,62, p = 0,01, le résultat le plus net de l'étude : −1 % de robusta ≈ +2,1 % de DF). Le KC réagit à la récolte d'arabica de la campagne suivante (−0,49, p = 0,07), pas à celle qu'on expédie (−0,08) ; le signal est plus fort pour la Colombie (−0,75) que pour le Brésil seul (−0,45).</w:t>
+        <w:t xml:space="preserve">Le DF réagit à la récolte de robusta de la campagne en cours (variations : −0,62, p = 0,01, significatif : −1 % de robusta ≈ +2,1 % de DF). Pour le KC, la piste est la récolte d'arabica de la campagne suivante (−0,49, p = 0,07), pas celle qu'on expédie (−0,08) ; le signal est plus fort pour la Colombie (−0,75) que pour le Brésil seul (−0,45). Ces tests KC sont exploratoires et restent à confirmer.</w:t>
       </w:r>
     </w:p>
     <w:p>
@@ -92,7 +92,7 @@
         <w:t xml:space="preserve">Le Brésil fait les chocs, le Vietnam n'a pas de coussin. </w:t>
       </w:r>
       <w:r>
-        <w:t xml:space="preserve">Le Brésil fait 83 % des chocs de la production mondiale et détient 53 % des stocks des pays d'origine. Le Vietnam garde moins d'une semaine d'exportations en stock : ses sécheresses passent directement dans le DF.</w:t>
+        <w:t xml:space="preserve">Le Brésil fait 83 % des chocs de la production mondiale et détient 53 % des stocks des pays d'origine. Le Vietnam garde moins d'une semaine d'exportations en stock : il n'a pas de coussin pour amortir une mauvaise récolte.</w:t>
       </w:r>
     </w:p>
     <w:p>
@@ -137,7 +137,7 @@
         <w:t xml:space="preserve">Les stocks certifiés. </w:t>
       </w:r>
       <w:r>
-        <w:t xml:space="preserve">Ils vont avec le prix en niveau (STU certifié arabica / KC : −0,61 ; robusta / DF : −0,56), mais ce lien vient surtout de la tendance commune (certifiés en baisse, prix en hausse depuis 2020) et du dernier point (fin août 2026). Sans tendance, ou d'une année sur l'autre, ils n'expliquent pas mieux le prix que la production. Aucun « effet ricochet » n'est démontré : on ne voit ni le prix remplir les certifiés, ni les certifiés annoncer le prix ; les données sont trop courtes pour exclure un effet modéré.</w:t>
+        <w:t xml:space="preserve">Ils vont avec le prix en niveau (STU certifié arabica / KC : −0,61 ; robusta / DF : −0,56), mais ce lien vient surtout de la tendance commune (certifiés en baisse, prix en hausse depuis 2020 : −0,34 une fois la tendance retirée), un peu du dernier point (fin août 2026 : −0,51 sans lui). Sans tendance, ou d'une année sur l'autre, ils n'expliquent pas mieux le prix que la production. Aucun « effet ricochet » n'est démontré : on ne voit ni le prix remplir les certifiés, ni les certifiés annoncer le prix ; les données sont trop courtes pour exclure un effet modéré.</w:t>
       </w:r>
     </w:p>
     <w:p>
@@ -155,7 +155,7 @@
         <w:t xml:space="preserve">Stocks USDA en hausse, certifiés en baisse. </w:t>
       </w:r>
       <w:r>
-        <w:t xml:space="preserve">Pour le robusta, les cinq cas de divergence ont suivi le sens des stocks USDA ; pour l'arabica, il n'y a pas de règle (un cas sur deux dans chaque sens). Plus largement, le sens de variation du STU n'a donné le sens du KC que 8 campagnes sur 14 (7 sur 14 avec le STU arabica) : ce n'est pas une règle de trading.</w:t>
+        <w:t xml:space="preserve">Robusta (certifiés de Londres) : 3 cas, et le DF a baissé les trois fois (−3 %, −12 %, −19 %). Arabica (certifiés New York) : 2 cas, KC +15 % puis −6 % : pas de règle. Dans l'autre sens (stocks USDA en baisse, certifiés en hausse), le DF a monté les deux fois, le KC une fois sur deux. C'est une observation sur quelques cas, pas une loi. Plus largement, le sens de variation du STU n'a donné le sens du KC que 8 campagnes sur 14 (7 sur 14 avec le STU arabica) : ce n'est pas une règle de trading.</w:t>
       </w:r>
     </w:p>
     <w:p>
@@ -187,7 +187,7 @@
     </w:p>
     <w:p>
       <w:r>
-        <w:t xml:space="preserve">1) La récolte à venir, Brésil d'abord (le choc, déclenché par la météo : gel, sécheresse) ; 2) le niveau des stocks, résumé par le STU mondial (ce qui donne sa taille au choc, surtout quand les stocks sont bas) ; 3) la récolte de robusta (Vietnam, conilon brésilien, Indonésie), qui fait le DF et pèse sur le KC. La consommation progresse régulièrement (+1,8 % par an) et ne réagit pas de façon mesurable d'une campagne à l'autre.</w:t>
+        <w:t xml:space="preserve">1) La récolte à venir, Brésil d'abord (le choc, déclenché par la météo : gel, sécheresse) ; 2) le niveau des stocks, résumé par le STU mondial (ce qui donne probablement sa taille au choc, surtout quand les stocks sont bas) ; 3) la récolte de robusta (Vietnam, conilon brésilien, Indonésie), qui fait le DF. La consommation progresse régulièrement (+1,8 % par an) et ne réagit pas de façon mesurable d'une campagne à l'autre.</w:t>
       </w:r>
     </w:p>
     <w:p>
@@ -201,7 +201,7 @@
     </w:p>
     <w:p>
       <w:r>
-        <w:t xml:space="preserve">STU mondial 2026/27 prévu par l'USDA : 7,8 %. La courbe donne un KC autour de 242 c/lb et un DF autour de 3 208 $/t. En août 2026, le marché cotait 313 c/lb et 3 696 $/t, soit +29 % et +15 % au-dessus de la courbe. Pour le KC, c'est la limite haute de la zone habituelle (±1 écart-type : −22 % / +28 %) ; pour le DF, c'est dans la zone (−18 % / +22 %). Ce n'est pas une prévision : la courbe ne donne qu'une zone de prix.</w:t>
+        <w:t xml:space="preserve">STU mondial 2026/27 prévu par l'USDA : 7,8 %. La courbe donne un KC autour de 242 c/lb et un DF autour de 3 208 $/t. En août 2026, le marché cotait 313 c/lb et 3 696 $/t, soit +29 % et +15 % au-dessus de la courbe. Pour le KC, c'est juste au-dessus de la limite haute de la zone habituelle (±1 écart-type : −22 % / +28 %) ; pour le DF, c'est dans la zone (−18 % / +22 %). Ce n'est pas une prévision : la courbe ne donne qu'une zone de prix.</w:t>
       </w:r>
     </w:p>
     <w:p>
@@ -399,7 +399,7 @@
         <w:t xml:space="preserve">Statistiques : </w:t>
       </w:r>
       <w:r>
-        <w:t xml:space="preserve">corrélations sur le logarithme des prix, 16 campagnes (15 avec les certifiés). Les séries annuelles sont très autocorrélées (0,77 pour le STU mondial, 0,71 pour le KC) : le « p corrigé » tient compte du nombre réel d'observations indépendantes. p = probabilité d'obtenir la corrélation par hasard ; sous 0,05, c'est significatif.</w:t>
+        <w:t xml:space="preserve">corrélations sur le logarithme des prix, 16 campagnes (15 avec les certifiés). Les séries annuelles sont très autocorrélées (0,77 pour le STU mondial, 0,71 pour le KC) : les p du rapport (niveau et sans tendance) tiennent compte du nombre réel d'observations indépendantes. p = probabilité d'obtenir la corrélation par hasard ; sous 0,05, c'est significatif.</w:t>
       </w:r>
     </w:p>
     <w:p>
@@ -747,7 +747,7 @@
     </w:p>
     <w:p>
       <w:r>
-        <w:t xml:space="preserve">Corrélation avec le KC en niveau : production −0,14, STU stocks de fin −0,39, STU certifié −0,61. En niveau, le STU certifié est donc le plus lié au KC, mais ce classement disparaît quand on retire la tendance (−0,35, −0,25, −0,34) ou quand on retire le point 2025/26 (certifiés : −0,51). Le STU arabica des pays d'origine tombe de 13,3 % (2013/14) à 2,6 % (2021/22 et 2024/25), les deux années de flambée du KC.</w:t>
+        <w:t xml:space="preserve">Corrélation avec le KC en niveau : production −0,14, STU stocks de fin −0,39, STU certifié −0,61. En niveau, le STU certifié est donc le plus lié au KC, mais ce classement disparaît quand on retire la tendance (−0,35, −0,25, −0,34). Sans le point 2025/26, le lien des certifiés s'affaiblit (−0,51) mais reste le plus fort. Le STU arabica des pays d'origine tombe de 13,3 % (2013/14) à 2,6 % (2021/22 et 2024/25), les deux années de flambée du KC.</w:t>
       </w:r>
     </w:p>
     <w:p>
@@ -2618,7 +2618,7 @@
     </w:p>
     <w:p>
       <w:r>
-        <w:t xml:space="preserve">Sous 8 %, prix environ deux fois plus hauts qu'au-dessus de 11 % ; mais c'est un seul épisode, trois campagnes consécutives. Entre 8 et 11 %, un choc météo peut faire flamber le prix (gel 2021 : KC +56 %) ; sans choc, il retombe. Au-dessus de 11 %, le KC est resté entre 105 et 161 c/lb, sauf en 2010/11 (STU 11,3 % mais KC 250 c/lb : stocks bas chez les producteurs, crise de production en Colombie, real fort).</w:t>
+        <w:t xml:space="preserve">Sous 8 %, prix environ deux fois plus hauts qu'au-dessus de 11 % ; mais c'est un seul épisode, trois campagnes consécutives. Entre 8 et 11 %, un choc météo peut faire flamber le prix (gel 2021 : KC +56 %) ; sans choc, il retombe. Au-dessus de 11 %, le KC est resté entre 105 et 161 c/lb, sauf en 2010/11 (STU 11,3 % mais KC 250 c/lb). Explication possible : la récolte colombienne était tombée à 8,5 M sacs, contre 12 à 14 M les années normales ; le real fort est une autre piste, non mesurée ici.</w:t>
       </w:r>
     </w:p>
     <w:p>
@@ -2995,7 +2995,7 @@
                 <w:sz w:val="16"/>
                 <w:szCs w:val="16"/>
               </w:rPr>
-              <w:t xml:space="preserve">0,22</w:t>
+              <w:t xml:space="preserve">0,23</w:t>
             </w:r>
           </w:p>
         </w:tc>
@@ -3140,7 +3140,7 @@
                 <w:sz w:val="16"/>
                 <w:szCs w:val="16"/>
               </w:rPr>
-              <w:t xml:space="preserve">0,39</w:t>
+              <w:t xml:space="preserve">0,55</w:t>
             </w:r>
           </w:p>
         </w:tc>
@@ -3425,7 +3425,7 @@
                 <w:sz w:val="16"/>
                 <w:szCs w:val="16"/>
               </w:rPr>
-              <w:t xml:space="preserve">0,23</w:t>
+              <w:t xml:space="preserve">0,43</w:t>
             </w:r>
           </w:p>
         </w:tc>
@@ -3565,7 +3565,7 @@
                 <w:sz w:val="16"/>
                 <w:szCs w:val="16"/>
               </w:rPr>
-              <w:t xml:space="preserve">0,20</w:t>
+              <w:t xml:space="preserve">0,41</w:t>
             </w:r>
           </w:p>
         </w:tc>
@@ -3710,7 +3710,7 @@
                 <w:sz w:val="16"/>
                 <w:szCs w:val="16"/>
               </w:rPr>
-              <w:t xml:space="preserve">0,33</w:t>
+              <w:t xml:space="preserve">0,36</w:t>
             </w:r>
           </w:p>
         </w:tc>
@@ -3850,7 +3850,7 @@
                 <w:sz w:val="16"/>
                 <w:szCs w:val="16"/>
               </w:rPr>
-              <w:t xml:space="preserve">0,03</w:t>
+              <w:t xml:space="preserve">0,27</w:t>
             </w:r>
           </w:p>
         </w:tc>
@@ -3995,7 +3995,7 @@
                 <w:sz w:val="16"/>
                 <w:szCs w:val="16"/>
               </w:rPr>
-              <w:t xml:space="preserve">0,03</w:t>
+              <w:t xml:space="preserve">0,32</w:t>
             </w:r>
           </w:p>
         </w:tc>
@@ -4316,7 +4316,7 @@
     </w:p>
     <w:p>
       <w:r>
-        <w:t xml:space="preserve">Lecture : tous les liens de niveau vont dans le sens attendu (stocks bas, prix hauts), mais une fois l'autocorrélation prise en compte, aucun n'est significatif au sens strict. Sans tendance, seul le STU mondial le reste (p ≈ 0,03). D'une campagne à l'autre, les stocks sont peu liés au prix : le prix anticipe les révisions de récolte avant que les stocks ne soient publiés.</w:t>
+        <w:t xml:space="preserve">Lecture : tous les liens de niveau vont dans le sens attendu (stocks bas, prix hauts), mais une fois l'autocorrélation prise en compte, aucun n'est significatif, ni en niveau ni sans tendance. Le STU mondial reste le plus fort une fois la tendance retirée (−0,58 et −0,59). D'une campagne à l'autre, les stocks sont peu liés au prix : le prix anticipe les révisions de récolte avant que les stocks ne soient publiés.</w:t>
       </w:r>
     </w:p>
     <w:p>
@@ -4349,7 +4349,7 @@
         </w:numPr>
       </w:pPr>
       <w:r>
-        <w:t xml:space="preserve">Formulation la plus solide, recalculée indépendamment : la variation du KC d'une campagne suit l'écart entre la prochaine récolte brésilienne d'arabica et celle de même phase deux ans plus tôt, environ −1,3 % de KC par % d'écart (R² 0,58 ; 0,44 en validation croisée). La réaction se concentre entre juillet-août et février, pendant la floraison et le développement de la récolte (r de −0,61 à −0,72 selon le mois de départ).</w:t>
+        <w:t xml:space="preserve">Formulation qui colle le mieux au KC (trouvée après plusieurs essais, donc exploratoire ; recalculée indépendamment) : la variation du KC d'une campagne suit l'écart entre la prochaine récolte brésilienne d'arabica et celle de même phase deux ans plus tôt, environ −1,3 % de KC par % d'écart (R² 0,58 ; 0,44 en validation croisée). La réaction se concentre entre juillet-août et février, pendant la floraison et le développement de la récolte (r de −0,61 à −0,72 selon le mois de départ).</w:t>
       </w:r>
     </w:p>
     <w:p>
@@ -4962,7 +4962,7 @@
         </w:numPr>
       </w:pPr>
       <w:r>
-        <w:t xml:space="preserve">Les certifiés baissent pendant les hausses (4 hausses du KC sur 5, 4 hausses du DF sur 4), mais ne remontent pas forcément pendant les baisses (une seule des quatre baisses complètes du KC). La baisse actuelle s'est faite avec des certifiés New York en chute (0,84 → 0,24 M sacs).</w:t>
+        <w:t xml:space="preserve">Les certifiés baissent pendant les hausses (4 hausses du KC sur 5, 4 hausses du DF sur 4), mais ne remontent pas forcément pendant les baisses (une seule des quatre baisses complètes du KC). Depuis le sommet de novembre 2025, les certifiés New York sont passés de 0,44 à 0,24 M sacs (fin août 2026) ; ils étaient à 0,84 en février 2025.</w:t>
       </w:r>
     </w:p>
     <w:p>
@@ -6650,7 +6650,7 @@
         </w:numPr>
       </w:pPr>
       <w:r>
-        <w:t xml:space="preserve">Vietnam : tendance de +0,4 M sacs par an, cycle faible (−0,30). Ses chocs viennent de la sécheresse (El Niño 2015/16, 2023/24).</w:t>
+        <w:t xml:space="preserve">Vietnam : tendance de +0,4 M sacs par an, cycle faible (−0,30). Ses baisses de récolte USDA : 2014/15 (−8 %), 2016/17 (−8 %), 2020/21 (−7 %), 2022/23 (−10 %) ; la sécheresse El Niño de 2015-2016 pèse sur la récolte 2016/17.</w:t>
       </w:r>
     </w:p>
     <w:p>
@@ -6769,7 +6769,7 @@
     </w:p>
     <w:p>
       <w:r>
-        <w:t xml:space="preserve">Application 2026/27 : STU prévu 7,8 % → KC de courbe 242 c/lb, DF 3 208 $/t, contre 313 c/lb et 3 696 $/t en août 2026. Le KC est à la limite haute de sa zone habituelle. Les stocks certifiés de New York sont au plus bas de notre série, qui commence en juin 2012 (0,24 M sacs fin août 2026) : cela peut expliquer une partie de la prime, sans que ce soit testé. Si la récolte record 2026/27 remplit les stocks visibles, le KC a de la place pour se rapprocher de la courbe ; l'année basse brésilienne 2027/28 et la météo (sécheresse, gel) sont les risques de hausse. Le STU 2026/27 est lui-même une prévision USDA de juin 2026. Ce n'est pas un conseil d'investissement.</w:t>
+        <w:t xml:space="preserve">Application 2026/27 : STU prévu 7,8 % → KC de courbe 242 c/lb, DF 3 208 $/t, contre 313 c/lb et 3 696 $/t en août 2026. Le KC est juste au-dessus de sa zone habituelle. Les stocks certifiés de New York sont au plus bas de notre série, qui commence en juin 2012 (0,24 M sacs fin août 2026) : cela peut expliquer une partie de la prime, sans que ce soit testé. Si la récolte record 2026/27 remplit les stocks visibles, le KC a de la place pour se rapprocher de la courbe ; l'année basse brésilienne 2027/28 et la météo (sécheresse, gel) sont les risques de hausse. Le STU 2026/27 est lui-même une prévision USDA de juin 2026. Ce n'est pas un conseil d'investissement.</w:t>
       </w:r>
     </w:p>
     <w:p>
@@ -6832,7 +6832,7 @@
         <w:t xml:space="preserve">3. La récolte de robusta. </w:t>
       </w:r>
       <w:r>
-        <w:t xml:space="preserve">Vietnam, conilon brésilien et Indonésie : −1 % de production robusta ≈ +2,1 % de DF la même campagne (le lien le plus net de l'étude), et le robusta pèse sur le KC par substitution dans les assemblages.</w:t>
+        <w:t xml:space="preserve">Vietnam, conilon brésilien et Indonésie : −1 % de production robusta ≈ +2,1 % de DF la même campagne (significatif). Un effet sur le KC par substitution dans les assemblages est plausible mais n'apparaît pas dans les données (−0,28, non significatif).</w:t>
       </w:r>
     </w:p>
     <w:p>
@@ -9586,7 +9586,7 @@
         <w:t xml:space="preserve">Vietnam : </w:t>
       </w:r>
       <w:r>
-        <w:t xml:space="preserve">17 % de la production mondiale et 18 % des exportations, mais moins d'une semaine d'exportations en stock (0,9). Pas de coussin : ses sécheresses passent directement dans le DF. Deuxième acteur des variations de stocks (18 %).</w:t>
+        <w:t xml:space="preserve">17 % de la production mondiale et 18 % des exportations, mais moins d'une semaine d'exportations en stock (0,9). Pas de coussin : une mauvaise récolte ne peut pas être amortie par ses stocks (lien récolte vietnamienne / DF : −0,35, non significatif, car le conilon brésilien et l'Indonésie comptent autant). Deuxième acteur des variations de stocks (18 %).</w:t>
       </w:r>
     </w:p>
     <w:p>

</xml_diff>

<commit_message>
STU report: add Brazil-only arabica stock-to-use sheet and section
New Excel sheet 7_Bresil_arabica (Brazil arabica production, ending
stocks / (consumption + exports), upper bound if all stocks were arabica,
KC1, two native charts) and a matching Word subsection with charts 13-14.

Co-Authored-By: Claude Opus 5.5 <noreply@anthropic.com>
Claude-Session: https://claude.ai/code/session_01Hsy3bDWLR2oyncbyTiqnwU
</commit_message>
<xml_diff>
--- a/coffee_stu/Bilan_STU_Cafe_2010-2026.docx
+++ b/coffee_stu/Bilan_STU_Cafe_2010-2026.docx
@@ -9653,6 +9653,592 @@
     </w:p>
     <w:p>
       <w:pPr>
+        <w:pStyle w:val="Heading2"/>
+        <w:keepNext/>
+      </w:pPr>
+      <w:r>
+        <w:t xml:space="preserve">Le Brésil seul : stock-to-use arabica et KC1</w:t>
+      </w:r>
+    </w:p>
+    <w:p>
+      <w:r>
+        <w:t xml:space="preserve">L'USDA ne publie pour le Brésil qu'un seul chiffre de stocks de fin, de consommation et d'exportations, arabica et conilon ensemble ; les 17 rapports USDA sur le café brésilien consultés (2010-2026) ne séparent pas non plus les stocks par espèce. Avec la méthode par part de production des sections 2 et 3, la part d'arabica s'annule : le STU arabica du Brésil est exactement égal au STU du Brésil. Si tous les stocks brésiliens étaient de l'arabica, le ratio serait de 23 % à 66 % plus élevé selon l'année (borne haute, onglet 7 de l'Excel).</w:t>
+      </w:r>
+    </w:p>
+    <w:p>
+      <w:pPr>
+        <w:pStyle w:val="Figure"/>
+        <w:keepNext/>
+      </w:pPr>
+      <w:r>
+        <w:drawing>
+          <wp:inline distT="0" distB="0" distL="0" distR="0">
+            <wp:extent cx="5940000" cy="2390907"/>
+            <wp:docPr id="13" name="Graphique 13"/>
+            <wp:cNvGraphicFramePr>
+              <a:graphicFrameLocks noChangeAspect="1"/>
+            </wp:cNvGraphicFramePr>
+            <a:graphic>
+              <a:graphicData uri="http://schemas.openxmlformats.org/drawingml/2006/picture">
+                <pic:pic>
+                  <pic:nvPicPr>
+                    <pic:cNvPr id="13" name="graphique13.png"/>
+                    <pic:cNvPicPr/>
+                  </pic:nvPicPr>
+                  <pic:blipFill>
+                    <a:blip r:embed="rIdImg13"/>
+                    <a:stretch>
+                      <a:fillRect/>
+                    </a:stretch>
+                  </pic:blipFill>
+                  <pic:spPr>
+                    <a:xfrm>
+                      <a:off x="0" y="0"/>
+                      <a:ext cx="5940000" cy="2390907"/>
+                    </a:xfrm>
+                    <a:prstGeom prst="rect">
+                      <a:avLst/>
+                    </a:prstGeom>
+                  </pic:spPr>
+                </pic:pic>
+              </a:graphicData>
+            </a:graphic>
+          </wp:inline>
+        </w:drawing>
+      </w:r>
+    </w:p>
+    <w:p>
+      <w:pPr>
+        <w:pStyle w:val="Caption"/>
+      </w:pPr>
+      <w:r>
+        <w:t xml:space="preserve">Graphique 13 — Production d'arabica du Brésil (colonnes) et KC1 (courbe, axe droit).</w:t>
+      </w:r>
+    </w:p>
+    <w:p>
+      <w:pPr>
+        <w:pStyle w:val="Figure"/>
+        <w:keepNext/>
+      </w:pPr>
+      <w:r>
+        <w:drawing>
+          <wp:inline distT="0" distB="0" distL="0" distR="0">
+            <wp:extent cx="5940000" cy="2390907"/>
+            <wp:docPr id="14" name="Graphique 14"/>
+            <wp:cNvGraphicFramePr>
+              <a:graphicFrameLocks noChangeAspect="1"/>
+            </wp:cNvGraphicFramePr>
+            <a:graphic>
+              <a:graphicData uri="http://schemas.openxmlformats.org/drawingml/2006/picture">
+                <pic:pic>
+                  <pic:nvPicPr>
+                    <pic:cNvPr id="14" name="graphique14.png"/>
+                    <pic:cNvPicPr/>
+                  </pic:nvPicPr>
+                  <pic:blipFill>
+                    <a:blip r:embed="rIdImg14"/>
+                    <a:stretch>
+                      <a:fillRect/>
+                    </a:stretch>
+                  </pic:blipFill>
+                  <pic:spPr>
+                    <a:xfrm>
+                      <a:off x="0" y="0"/>
+                      <a:ext cx="5940000" cy="2390907"/>
+                    </a:xfrm>
+                    <a:prstGeom prst="rect">
+                      <a:avLst/>
+                    </a:prstGeom>
+                  </pic:spPr>
+                </pic:pic>
+              </a:graphicData>
+            </a:graphic>
+          </wp:inline>
+        </w:drawing>
+      </w:r>
+    </w:p>
+    <w:p>
+      <w:pPr>
+        <w:pStyle w:val="Caption"/>
+      </w:pPr>
+      <w:r>
+        <w:t xml:space="preserve">Graphique 14 — STU du Brésil = stocks de fin ÷ (consommation domestique + exportations), avec KC1. C'est aussi le STU arabica du Brésil avec la méthode par part.</w:t>
+      </w:r>
+    </w:p>
+    <w:p>
+      <w:r>
+        <w:t xml:space="preserve">Le STU du Brésil va de 22,0 % (2013/14) à 0,9 % (2021/22). Il suit presque exactement le STU arabica des 42 pays d'origine (corrélation 0,98) : c'est le Brésil qui donne sa forme à la courbe arabica. Avec le KC, le lien est faible : −0,30 en niveau, −0,16 sans tendance, non significatif. La production d'arabica du Brésil de la même campagne n'est que faiblement liée au KC (−0,24 en niveau, −0,18 en variations) ; c'est la récolte suivante qui compte (section 5).</w:t>
+      </w:r>
+    </w:p>
+    <w:tbl>
+      <w:tblPr>
+        <w:tblStyle w:val="Grille"/>
+        <w:tblW w:w="9900" w:type="dxa"/>
+        <w:tblBorders>
+          <w:top w:val="single" w:sz="4" w:space="0" w:color="BFBFBF"/>
+          <w:left w:val="single" w:sz="4" w:space="0" w:color="BFBFBF"/>
+          <w:bottom w:val="single" w:sz="4" w:space="0" w:color="BFBFBF"/>
+          <w:right w:val="single" w:sz="4" w:space="0" w:color="BFBFBF"/>
+          <w:insideH w:val="single" w:sz="4" w:space="0" w:color="D9D9D9"/>
+          <w:insideV w:val="single" w:sz="4" w:space="0" w:color="D9D9D9"/>
+        </w:tblBorders>
+        <w:tblLayout w:type="fixed"/>
+        <w:tblCellMar>
+          <w:left w:w="70" w:type="dxa"/>
+          <w:right w:w="70" w:type="dxa"/>
+        </w:tblCellMar>
+      </w:tblPr>
+      <w:tblGrid>
+        <w:gridCol w:w="1700"/>
+        <w:gridCol w:w="5000"/>
+        <w:gridCol w:w="1600"/>
+        <w:gridCol w:w="1600"/>
+      </w:tblGrid>
+      <w:tr>
+        <w:trPr>
+          <w:tblHeader/>
+        </w:trPr>
+        <w:tc>
+          <w:tcPr>
+            <w:tcW w:w="1700" w:type="dxa"/>
+            <w:shd w:val="clear" w:color="auto" w:fill="1F3864"/>
+            <w:vAlign w:val="center"/>
+          </w:tcPr>
+          <w:p>
+            <w:pPr>
+              <w:spacing w:before="20" w:after="20"/>
+              <w:jc w:val="center"/>
+            </w:pPr>
+            <w:r>
+              <w:rPr>
+                <w:b/>
+                <w:color w:val="FFFFFF"/>
+                <w:sz w:val="16"/>
+                <w:szCs w:val="16"/>
+              </w:rPr>
+              <w:t xml:space="preserve">STU du Brésil</w:t>
+            </w:r>
+          </w:p>
+        </w:tc>
+        <w:tc>
+          <w:tcPr>
+            <w:tcW w:w="5000" w:type="dxa"/>
+            <w:shd w:val="clear" w:color="auto" w:fill="1F3864"/>
+            <w:vAlign w:val="center"/>
+          </w:tcPr>
+          <w:p>
+            <w:pPr>
+              <w:spacing w:before="20" w:after="20"/>
+              <w:jc w:val="center"/>
+            </w:pPr>
+            <w:r>
+              <w:rPr>
+                <w:b/>
+                <w:color w:val="FFFFFF"/>
+                <w:sz w:val="16"/>
+                <w:szCs w:val="16"/>
+              </w:rPr>
+              <w:t xml:space="preserve">Campagnes</w:t>
+            </w:r>
+          </w:p>
+        </w:tc>
+        <w:tc>
+          <w:tcPr>
+            <w:tcW w:w="1600" w:type="dxa"/>
+            <w:shd w:val="clear" w:color="auto" w:fill="1F3864"/>
+            <w:vAlign w:val="center"/>
+          </w:tcPr>
+          <w:p>
+            <w:pPr>
+              <w:spacing w:before="20" w:after="20"/>
+              <w:jc w:val="center"/>
+            </w:pPr>
+            <w:r>
+              <w:rPr>
+                <w:b/>
+                <w:color w:val="FFFFFF"/>
+                <w:sz w:val="16"/>
+                <w:szCs w:val="16"/>
+              </w:rPr>
+              <w:t xml:space="preserve">KC1 moyen (c/lb)</w:t>
+            </w:r>
+          </w:p>
+        </w:tc>
+        <w:tc>
+          <w:tcPr>
+            <w:tcW w:w="1600" w:type="dxa"/>
+            <w:shd w:val="clear" w:color="auto" w:fill="1F3864"/>
+            <w:vAlign w:val="center"/>
+          </w:tcPr>
+          <w:p>
+            <w:pPr>
+              <w:spacing w:before="20" w:after="20"/>
+              <w:jc w:val="center"/>
+            </w:pPr>
+            <w:r>
+              <w:rPr>
+                <w:b/>
+                <w:color w:val="FFFFFF"/>
+                <w:sz w:val="16"/>
+                <w:szCs w:val="16"/>
+              </w:rPr>
+              <w:t xml:space="preserve">KC1 min – max</w:t>
+            </w:r>
+          </w:p>
+        </w:tc>
+      </w:tr>
+      <w:tr>
+        <w:trPr>
+          <w:cantSplit/>
+        </w:trPr>
+        <w:tc>
+          <w:tcPr>
+            <w:tcW w:w="1700" w:type="dxa"/>
+            <w:vAlign w:val="center"/>
+          </w:tcPr>
+          <w:p>
+            <w:pPr>
+              <w:spacing w:before="20" w:after="20"/>
+              <w:jc w:val="left"/>
+            </w:pPr>
+            <w:r>
+              <w:rPr>
+                <w:b/>
+                <w:sz w:val="16"/>
+                <w:szCs w:val="16"/>
+              </w:rPr>
+              <w:t xml:space="preserve">&lt; 3 %</w:t>
+            </w:r>
+          </w:p>
+        </w:tc>
+        <w:tc>
+          <w:tcPr>
+            <w:tcW w:w="5000" w:type="dxa"/>
+            <w:vAlign w:val="center"/>
+          </w:tcPr>
+          <w:p>
+            <w:pPr>
+              <w:spacing w:before="20" w:after="20"/>
+              <w:jc w:val="right"/>
+            </w:pPr>
+            <w:r>
+              <w:rPr>
+                <w:sz w:val="16"/>
+                <w:szCs w:val="16"/>
+              </w:rPr>
+              <w:t xml:space="preserve">2021/22, 2024/25</w:t>
+            </w:r>
+          </w:p>
+        </w:tc>
+        <w:tc>
+          <w:tcPr>
+            <w:tcW w:w="1600" w:type="dxa"/>
+            <w:vAlign w:val="center"/>
+          </w:tcPr>
+          <w:p>
+            <w:pPr>
+              <w:spacing w:before="20" w:after="20"/>
+              <w:jc w:val="right"/>
+            </w:pPr>
+            <w:r>
+              <w:rPr>
+                <w:sz w:val="16"/>
+                <w:szCs w:val="16"/>
+              </w:rPr>
+              <w:t xml:space="preserve">279</w:t>
+            </w:r>
+          </w:p>
+        </w:tc>
+        <w:tc>
+          <w:tcPr>
+            <w:tcW w:w="1600" w:type="dxa"/>
+            <w:vAlign w:val="center"/>
+          </w:tcPr>
+          <w:p>
+            <w:pPr>
+              <w:spacing w:before="20" w:after="20"/>
+              <w:jc w:val="right"/>
+            </w:pPr>
+            <w:r>
+              <w:rPr>
+                <w:sz w:val="16"/>
+                <w:szCs w:val="16"/>
+              </w:rPr>
+              <w:t xml:space="preserve">224 – 333</w:t>
+            </w:r>
+          </w:p>
+        </w:tc>
+      </w:tr>
+      <w:tr>
+        <w:trPr>
+          <w:cantSplit/>
+        </w:trPr>
+        <w:tc>
+          <w:tcPr>
+            <w:tcW w:w="1700" w:type="dxa"/>
+            <w:shd w:val="clear" w:color="auto" w:fill="F2F4F7"/>
+            <w:vAlign w:val="center"/>
+          </w:tcPr>
+          <w:p>
+            <w:pPr>
+              <w:spacing w:before="20" w:after="20"/>
+              <w:jc w:val="left"/>
+            </w:pPr>
+            <w:r>
+              <w:rPr>
+                <w:b/>
+                <w:sz w:val="16"/>
+                <w:szCs w:val="16"/>
+              </w:rPr>
+              <w:t xml:space="preserve">3 – 6 %</w:t>
+            </w:r>
+          </w:p>
+        </w:tc>
+        <w:tc>
+          <w:tcPr>
+            <w:tcW w:w="5000" w:type="dxa"/>
+            <w:shd w:val="clear" w:color="auto" w:fill="F2F4F7"/>
+            <w:vAlign w:val="center"/>
+          </w:tcPr>
+          <w:p>
+            <w:pPr>
+              <w:spacing w:before="20" w:after="20"/>
+              <w:jc w:val="right"/>
+            </w:pPr>
+            <w:r>
+              <w:rPr>
+                <w:sz w:val="16"/>
+                <w:szCs w:val="16"/>
+              </w:rPr>
+              <w:t xml:space="preserve">2010/11, 2011/12, 2015/16, 2017/18, 2019/20, 2023/24</w:t>
+            </w:r>
+          </w:p>
+        </w:tc>
+        <w:tc>
+          <w:tcPr>
+            <w:tcW w:w="1600" w:type="dxa"/>
+            <w:shd w:val="clear" w:color="auto" w:fill="F2F4F7"/>
+            <w:vAlign w:val="center"/>
+          </w:tcPr>
+          <w:p>
+            <w:pPr>
+              <w:spacing w:before="20" w:after="20"/>
+              <w:jc w:val="right"/>
+            </w:pPr>
+            <w:r>
+              <w:rPr>
+                <w:sz w:val="16"/>
+                <w:szCs w:val="16"/>
+              </w:rPr>
+              <w:t xml:space="preserve">170</w:t>
+            </w:r>
+          </w:p>
+        </w:tc>
+        <w:tc>
+          <w:tcPr>
+            <w:tcW w:w="1600" w:type="dxa"/>
+            <w:shd w:val="clear" w:color="auto" w:fill="F2F4F7"/>
+            <w:vAlign w:val="center"/>
+          </w:tcPr>
+          <w:p>
+            <w:pPr>
+              <w:spacing w:before="20" w:after="20"/>
+              <w:jc w:val="right"/>
+            </w:pPr>
+            <w:r>
+              <w:rPr>
+                <w:sz w:val="16"/>
+                <w:szCs w:val="16"/>
+              </w:rPr>
+              <w:t xml:space="preserve">113 – 250</w:t>
+            </w:r>
+          </w:p>
+        </w:tc>
+      </w:tr>
+      <w:tr>
+        <w:trPr>
+          <w:cantSplit/>
+        </w:trPr>
+        <w:tc>
+          <w:tcPr>
+            <w:tcW w:w="1700" w:type="dxa"/>
+            <w:vAlign w:val="center"/>
+          </w:tcPr>
+          <w:p>
+            <w:pPr>
+              <w:spacing w:before="20" w:after="20"/>
+              <w:jc w:val="left"/>
+            </w:pPr>
+            <w:r>
+              <w:rPr>
+                <w:b/>
+                <w:sz w:val="16"/>
+                <w:szCs w:val="16"/>
+              </w:rPr>
+              <w:t xml:space="preserve">6 – 10 %</w:t>
+            </w:r>
+          </w:p>
+        </w:tc>
+        <w:tc>
+          <w:tcPr>
+            <w:tcW w:w="5000" w:type="dxa"/>
+            <w:vAlign w:val="center"/>
+          </w:tcPr>
+          <w:p>
+            <w:pPr>
+              <w:spacing w:before="20" w:after="20"/>
+              <w:jc w:val="right"/>
+            </w:pPr>
+            <w:r>
+              <w:rPr>
+                <w:sz w:val="16"/>
+                <w:szCs w:val="16"/>
+              </w:rPr>
+              <w:t xml:space="preserve">2016/17, 2018/19, 2020/21, 2022/23, 2025/26</w:t>
+            </w:r>
+          </w:p>
+        </w:tc>
+        <w:tc>
+          <w:tcPr>
+            <w:tcW w:w="1600" w:type="dxa"/>
+            <w:vAlign w:val="center"/>
+          </w:tcPr>
+          <w:p>
+            <w:pPr>
+              <w:spacing w:before="20" w:after="20"/>
+              <w:jc w:val="right"/>
+            </w:pPr>
+            <w:r>
+              <w:rPr>
+                <w:sz w:val="16"/>
+                <w:szCs w:val="16"/>
+              </w:rPr>
+              <w:t xml:space="preserve">175</w:t>
+            </w:r>
+          </w:p>
+        </w:tc>
+        <w:tc>
+          <w:tcPr>
+            <w:tcW w:w="1600" w:type="dxa"/>
+            <w:vAlign w:val="center"/>
+          </w:tcPr>
+          <w:p>
+            <w:pPr>
+              <w:spacing w:before="20" w:after="20"/>
+              <w:jc w:val="right"/>
+            </w:pPr>
+            <w:r>
+              <w:rPr>
+                <w:sz w:val="16"/>
+                <w:szCs w:val="16"/>
+              </w:rPr>
+              <w:t xml:space="preserve">105 – 312</w:t>
+            </w:r>
+          </w:p>
+        </w:tc>
+      </w:tr>
+      <w:tr>
+        <w:trPr>
+          <w:cantSplit/>
+        </w:trPr>
+        <w:tc>
+          <w:tcPr>
+            <w:tcW w:w="1700" w:type="dxa"/>
+            <w:shd w:val="clear" w:color="auto" w:fill="F2F4F7"/>
+            <w:vAlign w:val="center"/>
+          </w:tcPr>
+          <w:p>
+            <w:pPr>
+              <w:spacing w:before="20" w:after="20"/>
+              <w:jc w:val="left"/>
+            </w:pPr>
+            <w:r>
+              <w:rPr>
+                <w:b/>
+                <w:sz w:val="16"/>
+                <w:szCs w:val="16"/>
+              </w:rPr>
+              <w:t xml:space="preserve">&gt; 10 %</w:t>
+            </w:r>
+          </w:p>
+        </w:tc>
+        <w:tc>
+          <w:tcPr>
+            <w:tcW w:w="5000" w:type="dxa"/>
+            <w:shd w:val="clear" w:color="auto" w:fill="F2F4F7"/>
+            <w:vAlign w:val="center"/>
+          </w:tcPr>
+          <w:p>
+            <w:pPr>
+              <w:spacing w:before="20" w:after="20"/>
+              <w:jc w:val="right"/>
+            </w:pPr>
+            <w:r>
+              <w:rPr>
+                <w:sz w:val="16"/>
+                <w:szCs w:val="16"/>
+              </w:rPr>
+              <w:t xml:space="preserve">2012/13, 2013/14, 2014/15</w:t>
+            </w:r>
+          </w:p>
+        </w:tc>
+        <w:tc>
+          <w:tcPr>
+            <w:tcW w:w="1600" w:type="dxa"/>
+            <w:shd w:val="clear" w:color="auto" w:fill="F2F4F7"/>
+            <w:vAlign w:val="center"/>
+          </w:tcPr>
+          <w:p>
+            <w:pPr>
+              <w:spacing w:before="20" w:after="20"/>
+              <w:jc w:val="right"/>
+            </w:pPr>
+            <w:r>
+              <w:rPr>
+                <w:sz w:val="16"/>
+                <w:szCs w:val="16"/>
+              </w:rPr>
+              <w:t xml:space="preserve">152</w:t>
+            </w:r>
+          </w:p>
+        </w:tc>
+        <w:tc>
+          <w:tcPr>
+            <w:tcW w:w="1600" w:type="dxa"/>
+            <w:shd w:val="clear" w:color="auto" w:fill="F2F4F7"/>
+            <w:vAlign w:val="center"/>
+          </w:tcPr>
+          <w:p>
+            <w:pPr>
+              <w:spacing w:before="20" w:after="20"/>
+              <w:jc w:val="right"/>
+            </w:pPr>
+            <w:r>
+              <w:rPr>
+                <w:sz w:val="16"/>
+                <w:szCs w:val="16"/>
+              </w:rPr>
+              <w:t xml:space="preserve">141 – 161</w:t>
+            </w:r>
+          </w:p>
+        </w:tc>
+      </w:tr>
+    </w:tbl>
+    <w:p>
+      <w:pPr>
+        <w:spacing w:after="60"/>
+      </w:pPr>
+      <w:r>
+        <w:t xml:space="preserve"/>
+      </w:r>
+    </w:p>
+    <w:p>
+      <w:r>
+        <w:t xml:space="preserve">Ce qui ressort : les deux campagnes où les stocks brésiliens sont tombés presque à zéro (0,9 % en 2021/22 et 1,4 % en 2024/25, moins d'une semaine d'utilisation) sont les deux plus fortes flambées du KC (224 et 333 c/lb). Mais le lien joue dans les deux sens : selon l'USDA, en 2024 la petite récolte et les prix élevés ont poussé les producteurs à exporter, ce qui a presque vidé les stocks. Et en 2025/26, les stocks sont remontés à 6,5 % sans que le KC baisse beaucoup (312 c/lb sur 11 mois). Deux cas seulement : une observation, pas une règle.</w:t>
+      </w:r>
+    </w:p>
+    <w:p>
+      <w:pPr>
         <w:pStyle w:val="Heading1"/>
         <w:keepNext/>
       </w:pPr>

</xml_diff>